<commit_message>
Add lean funding plan, LatAm scale scenario and final Docs copy
</commit_message>
<xml_diff>
--- a/report/docs/Builder_Case_Docs.docx
+++ b/report/docs/Builder_Case_Docs.docx
@@ -138,7 +138,7 @@
           <w:color w:val="000000"/>
           <w:sz w:val="22"/>
         </w:rPr>
-        <w:t xml:space="preserve"> El gota a gota es 17,7% de la deuda de los hogares que ganan hasta un salario mínimo [R5, p. 4]. La amenaza es la forma principal de cobro en Costa Rica [R6] y lo primero en los casos que conoce la informante; en uno, una vendedora de comida "ni volvió a sacar el negocio" [Inf].</w:t>
+        <w:t xml:space="preserve"> El gota a gota es 17,7% de la deuda de los hogares que ganan hasta un salario mínimo [R5, p. 4]. La amenaza es la forma principal de cobro en Costa Rica [R6] y lo primero en los casos que conoce la informante [Inf].</w:t>
       </w:r>
     </w:p>
     <w:p>
@@ -213,7 +213,7 @@
           <w:color w:val="000000"/>
           <w:sz w:val="22"/>
         </w:rPr>
-        <w:t xml:space="preserve"> Un colaborador conversó en mi nombre con vendedores de carrito en la estación Universidades del MIO el 26 de septiembre. Tengo su resumen oral, sin número de vendedores ni citas de cada uno, y las respuestas de una informante de Cali que conoce varios casos (segunda mano, sin muestreo). Esto sirve para encontrar mecanismos, no para medir; por eso cruzo cada hallazgo con un dato o un estudio.</w:t>
+        <w:t xml:space="preserve"> Un colaborador conversó en mi nombre con vendedores de carrito en la estación Universidades del MIO el 26 de septiembre; tengo su resumen oral, sin número de vendedores, y las respuestas de una informante de Cali (segunda mano, sin muestreo; Anexo C). Sirve para encontrar mecanismos, no para medir; por eso cruzo cada hallazgo con un dato.</w:t>
       </w:r>
     </w:p>
     <w:p>
@@ -675,7 +675,7 @@
           <w:color w:val="000000"/>
           <w:sz w:val="22"/>
         </w:rPr>
-        <w:t xml:space="preserve"> El vendedor de carrito que cada mañana saca fiada la mercancía del día y la paga esa tarde, con 4 semanas o más de fiado con ese minorista [S]. En Cali y su área metropolitana hay 17.745 micronegocios ambulantes [R17, C. D.1_24C], y mi plan llega a 468 en el mes 12. El DANE casi no ve este fiado: solo 1,8% de los ambulantes que pidieron crédito se lo pidió a un proveedor [R2, C. 18.1]. Leído literal, serían unos 50 (17.745 × 15,4% que pide crédito [R2, C. 16.1] × 1,8%; cálculo propio), frente a los 904 del equilibrio. La otra lectura es que nadie llama "crédito" a la mercancía del día. Por eso lo primero es contar: si con los 5 primeros minoristas no llego a 40 vendedores con fiado diario, el modelo no cierra y lo digo.</w:t>
+        <w:t xml:space="preserve"> El vendedor de carrito que cada mañana saca fiada la mercancía del día y la paga esa tarde, con 4 semanas o más de fiado con ese minorista [S]. En Cali y su área metropolitana hay 17.745 micronegocios ambulantes [R17, C. D.1_24C], y mi plan llega a 468 en el mes 12. El DANE casi no ve este fiado: solo 1,8% de los ambulantes que pidieron crédito se lo pidió a un proveedor [R2, C. 18.1], unos 50 en Cali (con 15,4% que pide crédito [R2, C. 16.1]; cálculo propio), frente a los 279 del equilibrio. O nadie llama "crédito" a la mercancía del día. Por eso lo primero es contar: si con los 5 primeros minoristas no llego a 40 vendedores con fiado diario, el modelo no cierra y lo digo.</w:t>
       </w:r>
     </w:p>
     <w:p>
@@ -811,7 +811,7 @@
                 <w:color w:val="000000"/>
                 <w:sz w:val="18"/>
               </w:rPr>
-              <w:t>Constituyo una SAS de servicios de información [R18] y dejo corriendo el programa que lee la estación cada 30 minutos (API de datos.gov.co, WhatsApp Business)</w:t>
+              <w:t>Arranco como persona natural (SAS de servicios de información [R18] en el mes 7) y dejo corriendo el programa que lee la estación cada 30 minutos (API de datos.gov.co)</w:t>
             </w:r>
           </w:p>
         </w:tc>
@@ -831,7 +831,7 @@
                 <w:color w:val="000000"/>
                 <w:sz w:val="18"/>
               </w:rPr>
-              <w:t>Capital propio en la SAS</w:t>
+              <w:t>Capital propio</w:t>
             </w:r>
           </w:p>
         </w:tc>
@@ -935,7 +935,7 @@
                 <w:color w:val="000000"/>
                 <w:sz w:val="18"/>
               </w:rPr>
-              <w:t>Al pasar 5 mm, WhatsApp al minorista ("Rige la cláusula", Anexo B). El vendedor guarda hasta $15.000 y abona el resto; esa noche el minorista responde quién no alcanzó ("vendedor 3: $45.000")</w:t>
+              <w:t>Al pasar 5 mm, WhatsApp al minorista ("Rige la cláusula", Anexo B). El vendedor guarda hasta $15.000 y abona el resto; esa noche el minorista responde quién no alcanzó</w:t>
             </w:r>
           </w:p>
         </w:tc>
@@ -1079,7 +1079,7 @@
                 <w:color w:val="000000"/>
                 <w:sz w:val="18"/>
               </w:rPr>
-              <w:t>Única entrada de la SAS</w:t>
+              <w:t>Mi única entrada</w:t>
             </w:r>
           </w:p>
         </w:tc>
@@ -1112,7 +1112,7 @@
           <w:color w:val="000000"/>
           <w:sz w:val="22"/>
         </w:rPr>
-        <w:t xml:space="preserve"> Máximo 2 días aplazados abiertos por vendedor [S]. El programa solo habla con quien fía: un mensaje al vendedor sobre lo que debe podría leerse como cobranza [R19]. Elegí la lluvia porque llega después de sacar la mercancía. La enfermedad y los choques familiares no tienen dato público y el pase pedido por el deudor subió el impago [R16], así que quedan fuera, como la mercancía que se daña. El punto débil son dos días de lluvia seguidos: los tercios se suman y al vendedor le quedan $2.184 para la casa (Anexo B). Lo primero que pruebo es pagar en sextos, unos $7.800 diarios, y el puente cierra en 8 días de venta, no en 5 (cálculo propio).</w:t>
+        <w:t xml:space="preserve"> Máximo 2 días aplazados abiertos por vendedor [S]. El programa solo habla con quien fía: un mensaje al vendedor sobre lo que debe podría leerse como cobranza [R19]. Elegí la lluvia porque llega después de sacar la mercancía. La enfermedad y los choques familiares quedan fuera, como la mercancía que se daña: no tienen dato público y el pase pedido por el deudor subió el impago [R16]. El punto débil son dos días de lluvia seguidos: los tercios se suman y al vendedor le quedan $2.184 para la casa (Anexo B). Lo primero que pruebo es pagar en sextos, unos $7.800 diarios, y el puente cierra en 8 días de venta, no en 5 (cálculo propio).</w:t>
       </w:r>
     </w:p>
     <w:p>
@@ -1179,7 +1179,7 @@
           <w:color w:val="000000"/>
           <w:sz w:val="22"/>
         </w:rPr>
-        <w:t xml:space="preserve"> La regla actúa solo el día sin ingreso, cuando la falta de ahorro obliga a pedir: 49,9% de los adultos no podría reunir fondos de emergencia en 30 días o le sería muy difícil [R22]. Ese día, cubrir el fiado con un gota a gota a 20% le costaría de 16% a 32% de lo que gana (unos $38.600 diarios [R2, C. 24]; cálculo propio). Devuelve en tercios y solo en días de venta, como cobra el informal [R11].</w:t>
+        <w:t xml:space="preserve"> La regla actúa solo el día sin ingreso, cuando la falta de ahorro obliga a pedir: 49,9% de los adultos no podría reunir fondos de emergencia en 30 días o le sería muy difícil [R22]. Ese día, cubrir el fiado con un gota a gota a 20% le costaría de 16% a 32% de lo que gana (unos $38.600 diarios [R2, C. 24]; cálculo propio).</w:t>
       </w:r>
     </w:p>
     <w:p>
@@ -1231,7 +1231,7 @@
           <w:color w:val="000000"/>
           <w:sz w:val="22"/>
         </w:rPr>
-        <w:t xml:space="preserve"> Las que encontré venden plata a 30 días o más: Nequi [R24], los préstamos de Bogotá [R25] y el programa CREO [R26]; Tienda Pago, según su sitio, financia a bodegas el pago al distribuidor [R27]. El puente de un día ya se vende, caro: el "diario anticipado" de Corabastos cobra 10% en el día [R28, p. 7]. Aprendí que cobrar cuando entra la plata pesa más que el precio: el mismo seguro lo tomó 72% cobrado en la cosecha y 5% por adelantado [R29]. Lo más parecido a mi idea son las cláusulas de huracán de la deuda soberana, que suspenden pagos ante un evento medido; no encontré esa lógica en el fiado (búsqueda limitada). Aquí el plazo normal sigue en cero días y solo lo abre un dato público, no una solicitud del deudor.</w:t>
+        <w:t xml:space="preserve"> Las que encontré venden plata a 30 días o más: Nequi [R24], los préstamos de Bogotá [R25] y el programa CREO [R26]; Tienda Pago, según su sitio, financia a bodegas el pago al distribuidor [R27]. El puente de un día ya se vende, caro: el "diario anticipado" de Corabastos cobra 10% en el día [R28, p. 7]. Cobrar cuando entra la plata pesa más que el precio: el mismo seguro lo tomó 72% cobrado en la cosecha y 5% por adelantado [R29]. En la cláusula, el plazo normal sigue en cero días y solo lo abre un dato público, no una solicitud del deudor.</w:t>
       </w:r>
     </w:p>
     <w:p>
@@ -1263,7 +1263,7 @@
           <w:color w:val="000000"/>
           <w:sz w:val="22"/>
         </w:rPr>
-        <w:t>Tabla 3. Las seis respuestas, caso base (cálculo propio, Anexo B)</w:t>
+        <w:t>Tabla 3. Las seis respuestas: mi plan, sin salario hasta cubrir costos (cálculo propio, Anexo B)</w:t>
       </w:r>
     </w:p>
     <w:tbl>
@@ -1353,7 +1353,7 @@
                 <w:color w:val="000000"/>
                 <w:sz w:val="18"/>
               </w:rPr>
-              <w:t xml:space="preserve"> $3,9 millones. $0 para prestar, porque no presto</w:t>
+              <w:t xml:space="preserve"> $0,3 millones, o $3,3 millones si pago el concepto legal. $0 para prestar, porque no presto</w:t>
             </w:r>
           </w:p>
         </w:tc>
@@ -1373,7 +1373,7 @@
                 <w:color w:val="000000"/>
                 <w:sz w:val="18"/>
               </w:rPr>
-              <w:t>SAS $0,6 millones, abogado $3 millones, tarjetas $0,3 millones [S]. El programa lo hago yo</w:t>
+              <w:t>Tarjetas $0,3 millones [S]; concepto legal gratis en un consultorio jurídico universitario [S, no verificado] o $3 millones con abogado [S]. La SAS ($0,6 millones [S]) va en el mes 7</w:t>
             </w:r>
           </w:p>
         </w:tc>
@@ -1405,7 +1405,7 @@
                 <w:color w:val="000000"/>
                 <w:sz w:val="18"/>
               </w:rPr>
-              <w:t xml:space="preserve"> $2.530.905</w:t>
+              <w:t xml:space="preserve"> $430.000 en los meses 1 a 6; $780.000 desde el 7</w:t>
             </w:r>
           </w:p>
         </w:tc>
@@ -1425,7 +1425,7 @@
                 <w:color w:val="000000"/>
                 <w:sz w:val="18"/>
               </w:rPr>
-              <w:t>Mi salario de un mínimo de 2026 ($1.750.905 [R30]); transporte, celular, herramientas y contador, $780.000 [S]</w:t>
+              <w:t>Sin salario. Transporte, celular y herramientas, $430.000 [S]; desde el mes 7, contador, $350.000 [S]. Mi mínimo ($1.750.905 [R30]) sale solo del excedente</w:t>
             </w:r>
           </w:p>
         </w:tc>
@@ -1561,7 +1561,7 @@
                 <w:color w:val="000000"/>
                 <w:sz w:val="18"/>
               </w:rPr>
-              <w:t xml:space="preserve"> 904 vendedores que pagan, mes 22</w:t>
+              <w:t xml:space="preserve"> 279 vendedores que pagan, mes 10</w:t>
             </w:r>
           </w:p>
         </w:tc>
@@ -1581,7 +1581,7 @@
                 <w:color w:val="000000"/>
                 <w:sz w:val="18"/>
               </w:rPr>
-              <w:t>$2.530.905 / $2.800, con el ritmo de la fila 4</w:t>
+              <w:t>$780.000 / $2.800, con el ritmo de la fila 4</w:t>
             </w:r>
           </w:p>
         </w:tc>
@@ -1613,7 +1613,7 @@
                 <w:color w:val="000000"/>
                 <w:sz w:val="18"/>
               </w:rPr>
-              <w:t xml:space="preserve"> $34,5 millones con salario; $8,5 millones sin salario (equilibrio en el mes 10)</w:t>
+              <w:t xml:space="preserve"> $3,4 millones con el concepto gratis; $6,4 millones si lo pago</w:t>
             </w:r>
           </w:p>
         </w:tc>
@@ -1633,7 +1633,7 @@
                 <w:color w:val="000000"/>
                 <w:sz w:val="18"/>
               </w:rPr>
-              <w:t>Inversión más pérdidas acumuladas. Los $8,5 millones irían como capital de la SAS, nunca como préstamos del público [R21]; el resto sería capital semilla que hoy no tengo</w:t>
+              <w:t>Inversión más pérdidas hasta el mes 9. Sale de mis ahorros, nunca de préstamos del público [R21]. Fondo Emprender (SENA) ayudaría si abre convocatoria para Cali; hoy no hay [R31]</w:t>
             </w:r>
           </w:p>
         </w:tc>
@@ -1651,12 +1651,27 @@
       <w:r>
         <w:rPr>
           <w:rFonts w:ascii="Arial" w:hAnsi="Arial" w:cs="Arial" w:eastAsia="Arial"/>
+          <w:b w:val="0"/>
+          <w:i w:val="0"/>
+          <w:color w:val="000000"/>
+          <w:sz w:val="22"/>
+        </w:rPr>
+        <w:t>Con mi salario desde el mes 1: 904 vendedores, mes 22 y $34,5 millones.</w:t>
+      </w:r>
+    </w:p>
+    <w:p>
+      <w:pPr>
+        <w:spacing w:before="0" w:after="120" w:line="276" w:lineRule="auto"/>
+      </w:pPr>
+      <w:r>
+        <w:rPr>
+          <w:rFonts w:ascii="Arial" w:hAnsi="Arial" w:cs="Arial" w:eastAsia="Arial"/>
           <w:b/>
           <w:i w:val="0"/>
           <w:color w:val="000000"/>
           <w:sz w:val="22"/>
         </w:rPr>
-        <w:t>¿Cierra? Con mi salario, no cierra en los primeros 12 meses</w:t>
+        <w:t>¿Cierra? Sin salario, en el mes 10; con salario, en el mes 22.</w:t>
       </w:r>
       <w:r>
         <w:rPr>
@@ -1666,7 +1681,7 @@
           <w:color w:val="000000"/>
           <w:sz w:val="22"/>
         </w:rPr>
-        <w:t xml:space="preserve"> (en el mes 12 pierdo $1,37 millones al mes). En un caso conservador (la mitad del ritmo, 8 vendedores por minorista, 20% sin cobrar y $1.000 de costo directo) no cierra con salario en 60 meses; sin salario cierra en el mes 27 con $15,1 millones. Con tarifa de $2.000 no llego al equilibrio en 36 meses; con $6.000, en el mes 15. Si no cierra, será por volumen y por una tarifa que nadie ha pagado todavía, no por riesgo de crédito; por eso cobro desde el segundo mes y busco vender por mayorista.</w:t>
+        <w:t xml:space="preserve"> Elijo lo primero: arriesgo $3,4 a $6,4 millones y no $34,5 millones que no tengo, pero me pago un mínimo completo solo desde el mes 22. En un caso conservador (la mitad del ritmo, 8 vendedores por minorista y 20% sin cobrar) no cierra con salario en 60 meses; sin salario cierra en el mes 27 con $10 a $13 millones, sin pagarme un mínimo en 60 meses. Si no cierra, será por volumen y por una tarifa que nadie ha pagado todavía, no por riesgo de crédito; por eso cobro desde el segundo mes. Escenario, no caso base: la regla podría servir en otras ciudades porque solo pide fiado y lluvia abierta: México y Ecuador publican lluvia horaria sin registro [R32; R33], en Perú 35% de los préstamos informales se paga a diario [R12, p. 15] y cinco países suman 5,7 millones de ambulantes [R34, tabla 1; cálculo propio] (Anexo D). No sumo ingresos de ahí: fuera de Colombia no he medido el fiado.</w:t>
       </w:r>
     </w:p>
     <w:p>
@@ -1691,7 +1706,7 @@
           <w:color w:val="000000"/>
           <w:sz w:val="22"/>
         </w:rPr>
-        <w:t xml:space="preserve"> Con fiado de $62.000, 3% de impago [S] y margen de 10% [S], la cláusula se paga sola si le evita a quien fía perder 1 de cada 20 vendedores al año (cálculo propio). Lo difícil es la caja: con 12 vendedores, un día de lluvia le deja unos $562.000 sin cobrar; si no los tiene, la cláusula sube al mayorista.</w:t>
+        <w:t xml:space="preserve"> Con fiado de $62.000, 3% de impago [S] y margen de 10% [S], la cláusula se paga sola si le evita a quien fía perder 1 de cada 20 vendedores al año (cálculo propio). Lo difícil es la caja: con 12 vendedores, un día de lluvia le deja unos $562.000 sin cobrar; si no los tiene, sube al mayorista.</w:t>
       </w:r>
     </w:p>
     <w:p>
@@ -1733,7 +1748,7 @@
           <w:color w:val="000000"/>
           <w:sz w:val="22"/>
         </w:rPr>
-        <w:t xml:space="preserve"> (préstamo diario cobrado en la tienda). Parecía buena porque iba al usuario con más gota a gota y copiaba la cuota diaria. La maté por tres razones. A precio legal y con montos de ambulante, el neto por usuario va de $5.857 a -$26.143 al año, negativo desde 1,5% de pérdida por ciclo (cálculo propio). De dos casos de la informante saco una hipótesis: se le paga primero al que amenaza [Inf] y un prestamista legal quedaría de último. Y el vendedor ya tiene crédito diario sin interés [Col].</w:t>
+        <w:t xml:space="preserve"> (préstamo diario cobrado en la tienda). Parecía buena: iba al usuario con más gota a gota y copiaba la cuota diaria. La maté por dos razones. A precio legal y con montos de ambulante, el neto por usuario va de $5.857 a -$26.143 al año (cálculo propio). Y el vendedor ya tiene crédito diario sin interés [Col].</w:t>
       </w:r>
     </w:p>
     <w:p>
@@ -1758,7 +1773,7 @@
           <w:color w:val="000000"/>
           <w:sz w:val="22"/>
         </w:rPr>
-        <w:t xml:space="preserve"> (seguro paramétrico vía una aseguradora). Usaba el mismo dato y resolvía la licencia. Lo mató la frecuencia: con 26 días de lluvia al año, pagar el fiado entero exige una prima de unos $16.600 por día de venta, 43% del ingreso diario (cálculo propio con la siniestralidad de los microseguros [R31, p. 172]); además, la demanda de seguro de lluvia es baja aun a buen precio [R32]. Lo que me llevé: las pérdidas pequeñas y frecuentes se suavizan con plazo; se aseguran las raras.</w:t>
+        <w:t xml:space="preserve"> (seguro paramétrico vía una aseguradora). Usaba el mismo dato y resolvía la licencia. Lo mató la frecuencia: con 26 días de lluvia al año, pagar el fiado entero exige una prima de unos $16.600 por día de venta, 43% del ingreso diario (cálculo propio con la siniestralidad de los microseguros [R35, p. 172]); además, la demanda de seguro de lluvia es baja aun a buen precio [R36]. Lo que me llevé: las pérdidas pequeñas y frecuentes se suavizan con plazo; se aseguran las raras.</w:t>
       </w:r>
     </w:p>
     <w:p>
@@ -1783,7 +1798,7 @@
           <w:color w:val="000000"/>
           <w:sz w:val="22"/>
         </w:rPr>
-        <w:t xml:space="preserve"> Primera, que el hueco no esté donde creo: si el minorista ya espera (en la única etnografía del fiado en Cali que encontré se salda "en los próximos días" [R10]), o si la plata del gota a gota se va sobre todo al hogar (28,9% del crédito del ambulante va a gasto personal [R2, C. 21.1]), la cláusula cambia poco, y todo viene de un resumen oral de segunda mano. Segunda, que nadie quiera cargar el día de lluvia, porque hoy no le duele a quien fía, o que el minorista no tenga la caja; por eso no firmo antes de probar la premisa y, si él no puede esperar, voy al mayorista. Tercera, que la regla se copie: tras el mes gratis, el minorista puede usarla sin pagarme. Cobro la regla fijada de antemano, el registro y el acuerdo con el mayorista; si la siguen usando sin pagar, la tarifa no cierra.</w:t>
+        <w:t xml:space="preserve"> Primera, que el hueco no esté donde creo: si el minorista ya espera (en Cali el fiado se salda "en los próximos días" [R10]), o si la plata del gota a gota se va sobre todo al hogar (28,9% del crédito del ambulante va a gasto personal [R2, C. 21.1]), la cláusula cambia poco. Segunda, que a quien fía no le duela el día de lluvia o no tenga la caja; por eso no firmo antes de probar la premisa. Tercera, que tras el mes gratis el minorista copie la regla sin pagarme; cobro el registro y el acuerdo con el mayorista.</w:t>
       </w:r>
     </w:p>
     <w:p>
@@ -2323,7 +2338,7 @@
           <w:color w:val="000000"/>
           <w:sz w:val="22"/>
         </w:rPr>
-        <w:t>R31. Banca de las Oportunidades y Superintendencia Financiera de Colombia (2026). Reporte de Inclusión Financiera 2025. https://www.superfinanciera.gov.co/loader.php?lServicio=Tools2&amp;lTipo=descargas&amp;lFuncion=descargar&amp;idFile=1082980</w:t>
+        <w:t>R31. SENA, Fondo Emprender (2026). Convocatorias, consultado el 27 sep 2026 (vigente solo la Convocatoria Nacional Focalizada 124 Catatumbo). https://www.fondoemprender.com/SitePages/FondoEmprenderConvocatorias2020.aspx</w:t>
       </w:r>
     </w:p>
     <w:p>
@@ -2338,7 +2353,97 @@
           <w:color w:val="000000"/>
           <w:sz w:val="22"/>
         </w:rPr>
-        <w:t>R32. Cole, S., Giné, X., Tobacman, J., Topalova, P., Townsend, R. y Vickery, J. (2013). Barriers to Household Risk Management: Evidence from India. AEJ: Applied Economics 5(1), 104 a 135. https://www.aeaweb.org/articles?id=10.1257/app.5.1.104</w:t>
+        <w:t>R32. Servicio Meteorológico Nacional, CONAGUA (2026). Estaciones Meteorológicas Automáticas y visor de precipitación (sin registro). https://smn.conagua.gob.mx/es/observando-el-tiempo/estaciones-meteorologicas-automaticas-ema-s</w:t>
+      </w:r>
+    </w:p>
+    <w:p>
+      <w:pPr>
+        <w:spacing w:before="0" w:after="120" w:line="276" w:lineRule="auto"/>
+      </w:pPr>
+      <w:r>
+        <w:rPr>
+          <w:rFonts w:ascii="Arial" w:hAnsi="Arial" w:cs="Arial" w:eastAsia="Arial"/>
+          <w:b w:val="0"/>
+          <w:i w:val="0"/>
+          <w:color w:val="000000"/>
+          <w:sz w:val="22"/>
+        </w:rPr>
+        <w:t>R33. INAMHI (2026). Visor Hidrometeorológico, lluvia horaria de estaciones automáticas (sin registro). https://inamhi.gob.ec/info/</w:t>
+      </w:r>
+    </w:p>
+    <w:p>
+      <w:pPr>
+        <w:spacing w:before="0" w:after="120" w:line="276" w:lineRule="auto"/>
+      </w:pPr>
+      <w:r>
+        <w:rPr>
+          <w:rFonts w:ascii="Arial" w:hAnsi="Arial" w:cs="Arial" w:eastAsia="Arial"/>
+          <w:b w:val="0"/>
+          <w:i w:val="0"/>
+          <w:color w:val="000000"/>
+          <w:sz w:val="22"/>
+        </w:rPr>
+        <w:t>R34. Ramírez Reynoso, T. y Vanek, J. (2024). Street Vendors and Market Traders in 12 Countries: A Statistical Profile. WIEGO Statistical Brief No. 40, tabla 1. https://www.wiego.org/wp-content/uploads/2024/11/wiego-statistics-brief-no-40.pdf</w:t>
+      </w:r>
+    </w:p>
+    <w:p>
+      <w:pPr>
+        <w:spacing w:before="0" w:after="120" w:line="276" w:lineRule="auto"/>
+      </w:pPr>
+      <w:r>
+        <w:rPr>
+          <w:rFonts w:ascii="Arial" w:hAnsi="Arial" w:cs="Arial" w:eastAsia="Arial"/>
+          <w:b w:val="0"/>
+          <w:i w:val="0"/>
+          <w:color w:val="000000"/>
+          <w:sz w:val="22"/>
+        </w:rPr>
+        <w:t>R35. Banca de las Oportunidades y Superintendencia Financiera de Colombia (2026). Reporte de Inclusión Financiera 2025. https://www.superfinanciera.gov.co/loader.php?lServicio=Tools2&amp;lTipo=descargas&amp;lFuncion=descargar&amp;idFile=1082980</w:t>
+      </w:r>
+    </w:p>
+    <w:p>
+      <w:pPr>
+        <w:spacing w:before="0" w:after="120" w:line="276" w:lineRule="auto"/>
+      </w:pPr>
+      <w:r>
+        <w:rPr>
+          <w:rFonts w:ascii="Arial" w:hAnsi="Arial" w:cs="Arial" w:eastAsia="Arial"/>
+          <w:b w:val="0"/>
+          <w:i w:val="0"/>
+          <w:color w:val="000000"/>
+          <w:sz w:val="22"/>
+        </w:rPr>
+        <w:t>R36. Cole, S., Giné, X., Tobacman, J., Topalova, P., Townsend, R. y Vickery, J. (2013). Barriers to Household Risk Management: Evidence from India. AEJ: Applied Economics 5(1), 104 a 135. https://www.aeaweb.org/articles?id=10.1257/app.5.1.104</w:t>
+      </w:r>
+    </w:p>
+    <w:p>
+      <w:pPr>
+        <w:spacing w:before="0" w:after="120" w:line="276" w:lineRule="auto"/>
+      </w:pPr>
+      <w:r>
+        <w:rPr>
+          <w:rFonts w:ascii="Arial" w:hAnsi="Arial" w:cs="Arial" w:eastAsia="Arial"/>
+          <w:b w:val="0"/>
+          <w:i w:val="0"/>
+          <w:color w:val="000000"/>
+          <w:sz w:val="22"/>
+        </w:rPr>
+        <w:t>R37. Fundación WWB Colombia (2026). Sitio web, programas y educación financiera, consultado el 27 sep 2026. https://www.fundacionwwbcolombia.org/</w:t>
+      </w:r>
+    </w:p>
+    <w:p>
+      <w:pPr>
+        <w:spacing w:before="0" w:after="120" w:line="276" w:lineRule="auto"/>
+      </w:pPr>
+      <w:r>
+        <w:rPr>
+          <w:rFonts w:ascii="Arial" w:hAnsi="Arial" w:cs="Arial" w:eastAsia="Arial"/>
+          <w:b w:val="0"/>
+          <w:i w:val="0"/>
+          <w:color w:val="000000"/>
+          <w:sz w:val="22"/>
+        </w:rPr>
+        <w:t>R38. BID Lab (2026). Financing products (equity semilla de US$200.000 a US$500.000; proyectos de ecosistema de US$750.000 a US$2 millones). https://bidlab.org/en/products/financing-products</w:t>
       </w:r>
     </w:p>
     <w:p>
@@ -2380,7 +2485,7 @@
           <w:color w:val="000000"/>
           <w:sz w:val="22"/>
         </w:rPr>
-        <w:t xml:space="preserve"> Un archivo de Excel, prototipo.xlsx, que hace el cálculo central del mecanismo con fórmulas vivas: los supuestos van en celdas amarillas y los resultados se recalculan al cambiarlos. No tiene enlace público; lo llevo a la entrevista. La hoja 1 sigue a un vendedor durante 30 días de venta, con la lluvia de cada día como dato de entrada, por dos caminos: con la cláusula, lo que no alcanzó a pagar va en tercios; sin ella, lo cubre un gota a gota a 20% en 30 cuotas diarias. En el ejemplo (fiado de $62.000, 3 días de lluvia), el gota a gota termina en 3 préstamos, 2 de ellos para pagar cuotas del anterior, con $29.231 de interés (76% del ingreso de un día) y $63.043 pendientes al día 30; con la cláusula no queda nada pendiente. Tras dos días seguidos de lluvia, el vendedor paga $36.416 de lo aplazado dos días y le quedan $2.184 para la casa: el punto débil que quiero probar con sextos. La hoja 2 tiene los números de la SAS y da los mismos valores de la Tabla 3.</w:t>
+        <w:t xml:space="preserve"> Un archivo de Excel, prototipo.xlsx, que hace el cálculo central del mecanismo con fórmulas vivas: los supuestos van en celdas amarillas y los resultados se recalculan al cambiarlos. No tiene enlace público; lo llevo a la entrevista. La hoja 1 sigue a un vendedor durante 30 días de venta, con la lluvia de cada día como dato de entrada, por dos caminos: con la cláusula, lo que no alcanzó a pagar va en tercios; sin ella, lo cubre un gota a gota a 20% en 30 cuotas diarias. En el ejemplo (fiado de $62.000, 3 días de lluvia), el gota a gota termina en 3 préstamos, 2 de ellos para pagar cuotas del anterior, con $29.231 de interés (76% del ingreso de un día) y $63.043 pendientes al día 30; con la cláusula no queda nada pendiente. Tras dos días seguidos de lluvia, el vendedor paga $36.416 de lo aplazado dos días y le quedan $2.184 para la casa: el punto débil que quiero probar con sextos. La hoja 2 tiene los números de la SAS con salario y da los mismos valores de la comparación bajo la Tabla 3; el plan sin salario lo calculé con el mismo modelo en Python.</w:t>
       </w:r>
     </w:p>
     <w:p>
@@ -2497,7 +2602,7 @@
           <w:color w:val="000000"/>
           <w:sz w:val="22"/>
         </w:rPr>
-        <w:t xml:space="preserve"> Dividí la investigación en frentes (tamaño, cómo funciona el gota a gota, evidencia académica, intentos formales, fintechs, estructura legal, fiado y confianza) y usé Claude Code con agentes que buscaban y leían fuentes en paralelo. Cada cifra se contrastó con el documento original (el cuadro del DANE, la página del informe, el artículo de la ley) y solo uso las confirmadas. Después le pedí a un agente que leyera la propuesta con la rúbrica, como un jurado: la primera revisión marcó 19 afirmaciones sin respaldo, que corregí o saqué, y las siguientes me hicieron agregar el piso para la casa y medir la caja del minorista. Los cálculos son míos, en Python sobre datos abiertos; la IA me ayudó con el código y los borradores. Las notas de voz de la informante las transcribí en local con Whisper. Lo que decidí yo: organizar el campo, cambiar de la ventanilla del tendero a la cláusula después del campo, descartar el seguro con mis números y no usar cifras sin fuente, como "12 millones de colombianos usan gota a gota".</w:t>
+        <w:t xml:space="preserve"> Dividí la investigación en frentes (tamaño, cómo funciona el gota a gota, evidencia académica, intentos formales, fintechs, estructura legal, fiado y confianza) y usé Claude Code con agentes que buscaban y leían fuentes en paralelo. Cada cifra se contrastó con el documento original (el cuadro del DANE, la página del informe, el artículo de la ley) y solo uso las confirmadas. Después le pedí a un agente que leyera la propuesta con la rúbrica, como un jurado: la primera revisión marcó 19 afirmaciones sin respaldo, que corregí o saqué, y las siguientes me hicieron agregar el piso para la casa y medir la caja del minorista. Los cálculos son míos, en Python sobre datos abiertos; la IA me ayudó con el código y los borradores. Las notas de voz de la informante las transcribí en local con Whisper. Toda la investigación, las fuentes, la verificación y las notas de campo (anonimizadas) están en el repositorio público https://github.com/espinosacodes/makers-builder-case. En la primera pasada de verificación se revisaron 243 cifras; el detalle por resultado está en el repositorio. Lo que decidí yo: organizar el campo, cambiar de la ventanilla del tendero a la cláusula después del campo, descartar el seguro con mis números y no usar cifras sin fuente, como "12 millones de colombianos usan gota a gota".</w:t>
       </w:r>
     </w:p>
     <w:p>
@@ -2719,6 +2824,113 @@
           <w:sz w:val="22"/>
         </w:rPr>
         <w:t xml:space="preserve"> La última vez que llovió y no vendió, ¿el que le fía le esperó o le exigió esa tarde? ¿Lo que no vendió se dañó? ¿En qué se fue la plata del gota a gota? Al minorista: ¿le paga a su proveedor de contado o a plazo, y cuántos vendedores perdió este año por deudas?</w:t>
+      </w:r>
+    </w:p>
+    <w:p>
+      <w:pPr>
+        <w:pStyle w:val="Heading2"/>
+        <w:keepNext/>
+        <w:spacing w:before="240" w:after="120" w:line="276" w:lineRule="auto"/>
+      </w:pPr>
+      <w:r>
+        <w:rPr>
+          <w:rFonts w:ascii="Arial" w:hAnsi="Arial" w:cs="Arial" w:eastAsia="Arial"/>
+          <w:b/>
+          <w:i w:val="0"/>
+          <w:color w:val="000000"/>
+          <w:sz w:val="28"/>
+        </w:rPr>
+        <w:t>Anexo D. Ruta de escala</w:t>
+      </w:r>
+    </w:p>
+    <w:p>
+      <w:pPr>
+        <w:spacing w:before="0" w:after="120" w:line="276" w:lineRule="auto"/>
+      </w:pPr>
+      <w:r>
+        <w:rPr>
+          <w:rFonts w:ascii="Arial" w:hAnsi="Arial" w:cs="Arial" w:eastAsia="Arial"/>
+          <w:b w:val="0"/>
+          <w:i w:val="0"/>
+          <w:color w:val="000000"/>
+          <w:sz w:val="22"/>
+        </w:rPr>
+        <w:t>Esto es un escenario con condiciones de entrada. No es parte del caso base ni de la Tabla 3.</w:t>
+      </w:r>
+    </w:p>
+    <w:p>
+      <w:pPr>
+        <w:spacing w:before="0" w:after="120" w:line="276" w:lineRule="auto"/>
+      </w:pPr>
+      <w:r>
+        <w:rPr>
+          <w:rFonts w:ascii="Arial" w:hAnsi="Arial" w:cs="Arial" w:eastAsia="Arial"/>
+          <w:b/>
+          <w:i w:val="0"/>
+          <w:color w:val="000000"/>
+          <w:sz w:val="22"/>
+        </w:rPr>
+        <w:t>Fase 1: Cali, meses 1 a 12.</w:t>
+      </w:r>
+      <w:r>
+        <w:rPr>
+          <w:rFonts w:ascii="Arial" w:hAnsi="Arial" w:cs="Arial" w:eastAsia="Arial"/>
+          <w:b w:val="0"/>
+          <w:i w:val="0"/>
+          <w:color w:val="000000"/>
+          <w:sz w:val="22"/>
+        </w:rPr>
+        <w:t xml:space="preserve"> Paso a la fase 2 solo si se cumplen los umbrales de "Cómo sé si me equivoqué" y al menos un mayorista paga por sus minoristas. Busco como aliada a la Fundación WWB Colombia, que trabaja en Cali con microempresarias y hace educación financiera [R37]; con ella llegaría a minoristas sin ser un desconocido. No publica montos, así que no la cuento como plata.</w:t>
+      </w:r>
+    </w:p>
+    <w:p>
+      <w:pPr>
+        <w:spacing w:before="0" w:after="120" w:line="276" w:lineRule="auto"/>
+      </w:pPr>
+      <w:r>
+        <w:rPr>
+          <w:rFonts w:ascii="Arial" w:hAnsi="Arial" w:cs="Arial" w:eastAsia="Arial"/>
+          <w:b/>
+          <w:i w:val="0"/>
+          <w:color w:val="000000"/>
+          <w:sz w:val="22"/>
+        </w:rPr>
+        <w:t>Fase 2: una segunda ciudad.</w:t>
+      </w:r>
+      <w:r>
+        <w:rPr>
+          <w:rFonts w:ascii="Arial" w:hAnsi="Arial" w:cs="Arial" w:eastAsia="Arial"/>
+          <w:b w:val="0"/>
+          <w:i w:val="0"/>
+          <w:color w:val="000000"/>
+          <w:sz w:val="22"/>
+        </w:rPr>
+        <w:t xml:space="preserve"> La regla necesita tres piezas. Dos ya existen fuera de Colombia: el SMN de México y el INAMHI de Ecuador publican lluvia horaria sin registro, desde visores no documentados que pueden cambiar [R32; R33], y el gota a gota de cuota diaria está documentado en Perú (35% de los préstamos informales; 85% en Iquitos [R12, p. 15]). La tercera, el fiado diario de mercancía, no está medida fuera de Colombia: lo más cercano es que 38% de los ambulantes de cinco ciudades, entre ellas Lima, dice que el crédito es muy importante para escoger proveedor [R13, p. 39]. Por eso cada ciudad nueva empieza con el mismo conteo de 40 vendedores.</w:t>
+      </w:r>
+    </w:p>
+    <w:p>
+      <w:pPr>
+        <w:spacing w:before="0" w:after="120" w:line="276" w:lineRule="auto"/>
+      </w:pPr>
+      <w:r>
+        <w:rPr>
+          <w:rFonts w:ascii="Arial" w:hAnsi="Arial" w:cs="Arial" w:eastAsia="Arial"/>
+          <w:b/>
+          <w:i w:val="0"/>
+          <w:color w:val="000000"/>
+          <w:sz w:val="22"/>
+        </w:rPr>
+        <w:t>Fase 3: varias ciudades con un socio.</w:t>
+      </w:r>
+      <w:r>
+        <w:rPr>
+          <w:rFonts w:ascii="Arial" w:hAnsi="Arial" w:cs="Arial" w:eastAsia="Arial"/>
+          <w:b w:val="0"/>
+          <w:i w:val="0"/>
+          <w:color w:val="000000"/>
+          <w:sz w:val="22"/>
+        </w:rPr>
+        <w:t xml:space="preserve"> Solo con 12 meses de datos del piloto presentaría con una fundación un proyecto de ecosistema al BID Lab, que financia de US$750.000 a US$2 millones [R38]. Es una meta, no un ingreso proyectado.</w:t>
       </w:r>
     </w:p>
     <w:sectPr>

</xml_diff>